<commit_message>
Update PR_3.pbix file for enhanced data analysis and reporting
</commit_message>
<xml_diff>
--- a/PowerBi/PR_3/PR_3_Document.docx
+++ b/PowerBi/PR_3/PR_3_Document.docx
@@ -56,7 +56,7 @@
     <w:p>
       <w:r>
         <w:pict w14:anchorId="760CEE21">
-          <v:rect id="_x0000_i1100" style="width:0;height:1.5pt" o:hralign="center" o:hrstd="t" o:hr="t" fillcolor="#a0a0a0" stroked="f"/>
+          <v:rect id="_x0000_i1025" style="width:0;height:1.5pt" o:hralign="center" o:hrstd="t" o:hr="t" fillcolor="#a0a0a0" stroked="f"/>
         </w:pict>
       </w:r>
     </w:p>
@@ -95,17 +95,8 @@
           <w:b/>
           <w:bCs/>
         </w:rPr>
-        <w:t xml:space="preserve">Data </w:t>
-      </w:r>
-      <w:proofErr w:type="spellStart"/>
-      <w:r>
-        <w:rPr>
-          <w:b/>
-          <w:bCs/>
-        </w:rPr>
-        <w:t>Modeling</w:t>
-      </w:r>
-      <w:proofErr w:type="spellEnd"/>
+        <w:t>Data Modeling</w:t>
+      </w:r>
     </w:p>
     <w:p>
       <w:r>
@@ -230,7 +221,7 @@
     <w:p>
       <w:r>
         <w:pict w14:anchorId="69186C76">
-          <v:rect id="_x0000_i1101" style="width:0;height:1.5pt" o:hralign="center" o:hrstd="t" o:hr="t" fillcolor="#a0a0a0" stroked="f"/>
+          <v:rect id="_x0000_i1026" style="width:0;height:1.5pt" o:hralign="center" o:hrstd="t" o:hr="t" fillcolor="#a0a0a0" stroked="f"/>
         </w:pict>
       </w:r>
     </w:p>
@@ -324,7 +315,7 @@
     <w:p>
       <w:r>
         <w:pict w14:anchorId="6905CA19">
-          <v:rect id="_x0000_i1102" style="width:0;height:1.5pt" o:hralign="center" o:hrstd="t" o:hr="t" fillcolor="#a0a0a0" stroked="f"/>
+          <v:rect id="_x0000_i1027" style="width:0;height:1.5pt" o:hralign="center" o:hrstd="t" o:hr="t" fillcolor="#a0a0a0" stroked="f"/>
         </w:pict>
       </w:r>
     </w:p>
@@ -378,15 +369,7 @@
         </w:numPr>
       </w:pPr>
       <w:r>
-        <w:t xml:space="preserve">CALCULATE changes filter </w:t>
-      </w:r>
-      <w:proofErr w:type="spellStart"/>
-      <w:r>
-        <w:t>behavior</w:t>
-      </w:r>
-      <w:proofErr w:type="spellEnd"/>
-      <w:r>
-        <w:t xml:space="preserve"> and must be used carefully</w:t>
+        <w:t>CALCULATE changes filter behavior and must be used carefully</w:t>
       </w:r>
     </w:p>
     <w:p>
@@ -397,15 +380,7 @@
         </w:numPr>
       </w:pPr>
       <w:r>
-        <w:t xml:space="preserve">Strong data </w:t>
-      </w:r>
-      <w:proofErr w:type="spellStart"/>
-      <w:r>
-        <w:t>modeling</w:t>
-      </w:r>
-      <w:proofErr w:type="spellEnd"/>
-      <w:r>
-        <w:t xml:space="preserve"> is necessary for correct results</w:t>
+        <w:t>Strong data modeling is necessary for correct results</w:t>
       </w:r>
     </w:p>
     <w:p>
@@ -422,7 +397,7 @@
     <w:p>
       <w:r>
         <w:pict w14:anchorId="1E271C1E">
-          <v:rect id="_x0000_i1103" style="width:0;height:1.5pt" o:hralign="center" o:hrstd="t" o:hr="t" fillcolor="#a0a0a0" stroked="f"/>
+          <v:rect id="_x0000_i1028" style="width:0;height:1.5pt" o:hralign="center" o:hrstd="t" o:hr="t" fillcolor="#a0a0a0" stroked="f"/>
         </w:pict>
       </w:r>
     </w:p>
@@ -451,26 +426,21 @@
     </w:p>
     <w:p>
       <w:r>
-        <w:t xml:space="preserve">Successfully built a working Power BI model with multiple DAX calculations and </w:t>
-      </w:r>
-      <w:proofErr w:type="spellStart"/>
-      <w:r>
-        <w:t>analyzed</w:t>
-      </w:r>
-      <w:proofErr w:type="spellEnd"/>
-      <w:r>
-        <w:t xml:space="preserve"> business data using Matrix visual only.</w:t>
+        <w:t>Successfully built a working Power BI model with multiple DAX calculations and analyzed business data using Matrix visual only.</w:t>
       </w:r>
     </w:p>
     <w:p>
       <w:r>
         <w:pict w14:anchorId="5D6E681D">
-          <v:rect id="_x0000_i1104" style="width:0;height:1.5pt" o:hralign="center" o:hrstd="t" o:hr="t" fillcolor="#a0a0a0" stroked="f"/>
+          <v:rect id="_x0000_i1029" style="width:0;height:1.5pt" o:hralign="center" o:hrstd="t" o:hr="t" fillcolor="#a0a0a0" stroked="f"/>
         </w:pict>
       </w:r>
     </w:p>
     <w:p>
       <w:r>
+        <w:rPr>
+          <w:noProof/>
+        </w:rPr>
         <w:drawing>
           <wp:inline distT="0" distB="0" distL="0" distR="0" wp14:anchorId="2FB61883" wp14:editId="41FBC996">
             <wp:extent cx="5731510" cy="2426335"/>
@@ -509,6 +479,84 @@
       </w:r>
       <w:r>
         <w:drawing>
+          <wp:inline distT="0" distB="0" distL="0" distR="0" wp14:anchorId="1E6FAF3F" wp14:editId="06BEDB4B">
+            <wp:extent cx="5731510" cy="3319780"/>
+            <wp:effectExtent l="0" t="0" r="2540" b="0"/>
+            <wp:docPr id="183568676" name="Picture 1"/>
+            <wp:cNvGraphicFramePr>
+              <a:graphicFrameLocks xmlns:a="http://schemas.openxmlformats.org/drawingml/2006/main" noChangeAspect="1"/>
+            </wp:cNvGraphicFramePr>
+            <a:graphic xmlns:a="http://schemas.openxmlformats.org/drawingml/2006/main">
+              <a:graphicData uri="http://schemas.openxmlformats.org/drawingml/2006/picture">
+                <pic:pic xmlns:pic="http://schemas.openxmlformats.org/drawingml/2006/picture">
+                  <pic:nvPicPr>
+                    <pic:cNvPr id="183568676" name=""/>
+                    <pic:cNvPicPr/>
+                  </pic:nvPicPr>
+                  <pic:blipFill>
+                    <a:blip r:embed="rId6"/>
+                    <a:stretch>
+                      <a:fillRect/>
+                    </a:stretch>
+                  </pic:blipFill>
+                  <pic:spPr>
+                    <a:xfrm>
+                      <a:off x="0" y="0"/>
+                      <a:ext cx="5731510" cy="3319780"/>
+                    </a:xfrm>
+                    <a:prstGeom prst="rect">
+                      <a:avLst/>
+                    </a:prstGeom>
+                  </pic:spPr>
+                </pic:pic>
+              </a:graphicData>
+            </a:graphic>
+          </wp:inline>
+        </w:drawing>
+      </w:r>
+      <w:r>
+        <w:lastRenderedPageBreak/>
+        <w:drawing>
+          <wp:inline distT="0" distB="0" distL="0" distR="0" wp14:anchorId="69A0954B" wp14:editId="4B0049A3">
+            <wp:extent cx="5731510" cy="3245485"/>
+            <wp:effectExtent l="0" t="0" r="2540" b="0"/>
+            <wp:docPr id="437294585" name="Picture 1"/>
+            <wp:cNvGraphicFramePr>
+              <a:graphicFrameLocks xmlns:a="http://schemas.openxmlformats.org/drawingml/2006/main" noChangeAspect="1"/>
+            </wp:cNvGraphicFramePr>
+            <a:graphic xmlns:a="http://schemas.openxmlformats.org/drawingml/2006/main">
+              <a:graphicData uri="http://schemas.openxmlformats.org/drawingml/2006/picture">
+                <pic:pic xmlns:pic="http://schemas.openxmlformats.org/drawingml/2006/picture">
+                  <pic:nvPicPr>
+                    <pic:cNvPr id="437294585" name=""/>
+                    <pic:cNvPicPr/>
+                  </pic:nvPicPr>
+                  <pic:blipFill>
+                    <a:blip r:embed="rId7"/>
+                    <a:stretch>
+                      <a:fillRect/>
+                    </a:stretch>
+                  </pic:blipFill>
+                  <pic:spPr>
+                    <a:xfrm>
+                      <a:off x="0" y="0"/>
+                      <a:ext cx="5731510" cy="3245485"/>
+                    </a:xfrm>
+                    <a:prstGeom prst="rect">
+                      <a:avLst/>
+                    </a:prstGeom>
+                  </pic:spPr>
+                </pic:pic>
+              </a:graphicData>
+            </a:graphic>
+          </wp:inline>
+        </w:drawing>
+      </w:r>
+      <w:r>
+        <w:rPr>
+          <w:noProof/>
+        </w:rPr>
+        <w:drawing>
           <wp:inline distT="0" distB="0" distL="0" distR="0" wp14:anchorId="744DBD12" wp14:editId="7ECE8EB1">
             <wp:extent cx="5731510" cy="2332355"/>
             <wp:effectExtent l="0" t="0" r="2540" b="0"/>
@@ -524,7 +572,7 @@
                     <pic:cNvPicPr/>
                   </pic:nvPicPr>
                   <pic:blipFill>
-                    <a:blip r:embed="rId6"/>
+                    <a:blip r:embed="rId8"/>
                     <a:stretch>
                       <a:fillRect/>
                     </a:stretch>
@@ -545,6 +593,9 @@
         </w:drawing>
       </w:r>
       <w:r>
+        <w:rPr>
+          <w:noProof/>
+        </w:rPr>
         <w:lastRenderedPageBreak/>
         <w:drawing>
           <wp:inline distT="0" distB="0" distL="0" distR="0" wp14:anchorId="0AE4BFA7" wp14:editId="04991774">
@@ -562,7 +613,7 @@
                     <pic:cNvPicPr/>
                   </pic:nvPicPr>
                   <pic:blipFill>
-                    <a:blip r:embed="rId7"/>
+                    <a:blip r:embed="rId9"/>
                     <a:stretch>
                       <a:fillRect/>
                     </a:stretch>
@@ -583,6 +634,9 @@
         </w:drawing>
       </w:r>
       <w:r>
+        <w:rPr>
+          <w:noProof/>
+        </w:rPr>
         <w:lastRenderedPageBreak/>
         <w:drawing>
           <wp:inline distT="0" distB="0" distL="0" distR="0" wp14:anchorId="56F801A6" wp14:editId="03640F35">
@@ -600,7 +654,7 @@
                     <pic:cNvPicPr/>
                   </pic:nvPicPr>
                   <pic:blipFill>
-                    <a:blip r:embed="rId8"/>
+                    <a:blip r:embed="rId10"/>
                     <a:stretch>
                       <a:fillRect/>
                     </a:stretch>
@@ -2303,6 +2357,7 @@
   <w:style w:type="character" w:default="1" w:styleId="DefaultParagraphFont">
     <w:name w:val="Default Paragraph Font"/>
     <w:uiPriority w:val="1"/>
+    <w:semiHidden/>
     <w:unhideWhenUsed/>
   </w:style>
   <w:style w:type="table" w:default="1" w:styleId="TableNormal">

</xml_diff>